<commit_message>
Replace the UI setup brief with the updated document
Co-authored-by: Bonginkosi Gama <iambpg@users.noreply.github.com>
</commit_message>
<xml_diff>
--- a/docs/insightengine-ui-setup-brief.docx
+++ b/docs/insightengine-ui-setup-brief.docx
@@ -70,16 +70,16 @@
     </w:p>
     <w:p>
       <w:r>
-        <w:t xml:space="preserve">InsightEngine is installed on one monitoring server at </w:t>
+        <w:t xml:space="preserve">InsightEngine is </w:t>
       </w:r>
       <w:r>
         <w:rPr>
           <w:b/>
         </w:rPr>
-        <w:t>one client’s site</w:t>
-      </w:r>
-      <w:r>
-        <w:t xml:space="preserve"> (one install per client). It is sized, as an estimate, for about 20,000 devices per client. It replaces my old Docker Compose monitoring stack.</w:t>
+        <w:t>one client per server</w:t>
+      </w:r>
+      <w:r>
+        <w:t>: it is installed on one monitoring server at one client’s site. It is sized, as an estimate, for about 20,000 devices per client. It replaces my old Docker Compose monitoring stack.</w:t>
       </w:r>
     </w:p>
     <w:p>
@@ -2361,7 +2361,7 @@
         <w:t>setup_token</w:t>
       </w:r>
       <w:r>
-        <w:t xml:space="preserve"> secret mount. Admin-only access to the Settings screens is your UI’s job (role check), in addition to the token. How users sign in to your UI is still open (Open item 2).</w:t>
+        <w:t xml:space="preserve"> secret mount. Admin-only access to the Settings screens is your UI’s job (role check), in addition to the token. How users sign in to your UI is still open (Open item 1).</w:t>
       </w:r>
     </w:p>
     <w:p>
@@ -6348,7 +6348,7 @@
               <w:rPr>
                 <w:sz w:val="17"/>
               </w:rPr>
-              <w:t>None yet (Open item 3)</w:t>
+              <w:t>None yet (Open item 2)</w:t>
             </w:r>
           </w:p>
         </w:tc>
@@ -6411,7 +6411,7 @@
               <w:rPr>
                 <w:sz w:val="17"/>
               </w:rPr>
-              <w:t>None yet (Open item 3)</w:t>
+              <w:t>None yet (Open item 2)</w:t>
             </w:r>
           </w:p>
         </w:tc>
@@ -8507,20 +8507,7 @@
               <w:rPr>
                 <w:sz w:val="17"/>
               </w:rPr>
-              <w:t>Multi-client: I mentioned “client 2”. Not confirmed whether a second client is meant. The bundle and this brief are one client per server (</w:t>
-            </w:r>
-            <w:r>
-              <w:rPr>
-                <w:rFonts w:ascii="IBM Plex Mono" w:hAnsi="IBM Plex Mono"/>
-                <w:sz w:val="16"/>
-              </w:rPr>
-              <w:t>schema: 1</w:t>
-            </w:r>
-            <w:r>
-              <w:rPr>
-                <w:sz w:val="17"/>
-              </w:rPr>
-              <w:t xml:space="preserve"> in the config store).</w:t>
+              <w:t>Settings access after setup: the internal backend path is defined (section 5), but sign-in to your UI, the identity provider and the role check are not decided, nor whether the setup service is stopped after setup (that disables rename and move).</w:t>
             </w:r>
           </w:p>
         </w:tc>
@@ -8570,7 +8557,20 @@
               <w:rPr>
                 <w:sz w:val="17"/>
               </w:rPr>
-              <w:t>Settings access after setup: the internal backend path is defined (section 5), but sign-in to your UI, the identity provider and the role check are not decided, nor whether the setup service is stopped after setup (that disables rename and move).</w:t>
+              <w:t xml:space="preserve">No API yet for the Database tab (each app’s database and tables) or the Alertmanager webhook page (who writes </w:t>
+            </w:r>
+            <w:r>
+              <w:rPr>
+                <w:rFonts w:ascii="IBM Plex Mono" w:hAnsi="IBM Plex Mono"/>
+                <w:sz w:val="16"/>
+              </w:rPr>
+              <w:t>config/alert-relay/destinations.json</w:t>
+            </w:r>
+            <w:r>
+              <w:rPr>
+                <w:sz w:val="17"/>
+              </w:rPr>
+              <w:t>).</w:t>
             </w:r>
           </w:p>
         </w:tc>
@@ -8620,20 +8620,33 @@
               <w:rPr>
                 <w:sz w:val="17"/>
               </w:rPr>
-              <w:t xml:space="preserve">No API yet for the Database tab (each app’s database and tables) or the Alertmanager webhook page (who writes </w:t>
+              <w:t xml:space="preserve">Error shape: the setup API sends </w:t>
             </w:r>
             <w:r>
               <w:rPr>
                 <w:rFonts w:ascii="IBM Plex Mono" w:hAnsi="IBM Plex Mono"/>
                 <w:sz w:val="16"/>
               </w:rPr>
-              <w:t>config/alert-relay/destinations.json</w:t>
+              <w:t>{"error": "text"}</w:t>
             </w:r>
             <w:r>
               <w:rPr>
                 <w:sz w:val="17"/>
               </w:rPr>
-              <w:t>).</w:t>
+              <w:t xml:space="preserve">; the design pack’s Insight API uses </w:t>
+            </w:r>
+            <w:r>
+              <w:rPr>
+                <w:rFonts w:ascii="IBM Plex Mono" w:hAnsi="IBM Plex Mono"/>
+                <w:sz w:val="16"/>
+              </w:rPr>
+              <w:t>{"error": {"code", "message"}}</w:t>
+            </w:r>
+            <w:r>
+              <w:rPr>
+                <w:sz w:val="17"/>
+              </w:rPr>
+              <w:t>. Pick one.</w:t>
             </w:r>
           </w:p>
         </w:tc>
@@ -8683,33 +8696,7 @@
               <w:rPr>
                 <w:sz w:val="17"/>
               </w:rPr>
-              <w:t xml:space="preserve">Error shape: the setup API sends </w:t>
-            </w:r>
-            <w:r>
-              <w:rPr>
-                <w:rFonts w:ascii="IBM Plex Mono" w:hAnsi="IBM Plex Mono"/>
-                <w:sz w:val="16"/>
-              </w:rPr>
-              <w:t>{"error": "text"}</w:t>
-            </w:r>
-            <w:r>
-              <w:rPr>
-                <w:sz w:val="17"/>
-              </w:rPr>
-              <w:t xml:space="preserve">; the design pack’s Insight API uses </w:t>
-            </w:r>
-            <w:r>
-              <w:rPr>
-                <w:rFonts w:ascii="IBM Plex Mono" w:hAnsi="IBM Plex Mono"/>
-                <w:sz w:val="16"/>
-              </w:rPr>
-              <w:t>{"error": {"code", "message"}}</w:t>
-            </w:r>
-            <w:r>
-              <w:rPr>
-                <w:sz w:val="17"/>
-              </w:rPr>
-              <w:t>. Pick one.</w:t>
+              <w:t>Docker proxy risk: root-equivalent for whoever holds the setup token (section 7). I need to accept it or reduce it.</w:t>
             </w:r>
           </w:p>
         </w:tc>
@@ -8744,56 +8731,6 @@
                 <w:sz w:val="17"/>
               </w:rPr>
               <w:t>5</w:t>
-            </w:r>
-          </w:p>
-        </w:tc>
-        <w:tc>
-          <w:tcPr>
-            <w:tcW w:type="dxa" w:w="7710"/>
-          </w:tcPr>
-          <w:p>
-            <w:pPr>
-              <w:spacing w:after="0"/>
-            </w:pPr>
-            <w:r>
-              <w:rPr>
-                <w:sz w:val="17"/>
-              </w:rPr>
-              <w:t>Docker proxy risk: root-equivalent for whoever holds the setup token (section 7). I need to accept it or reduce it.</w:t>
-            </w:r>
-          </w:p>
-        </w:tc>
-        <w:tc>
-          <w:tcPr>
-            <w:tcW w:type="dxa" w:w="1474"/>
-          </w:tcPr>
-          <w:p>
-            <w:pPr>
-              <w:spacing w:after="0"/>
-            </w:pPr>
-            <w:r>
-              <w:rPr>
-                <w:sz w:val="17"/>
-              </w:rPr>
-              <w:t>Open</w:t>
-            </w:r>
-          </w:p>
-        </w:tc>
-      </w:tr>
-      <w:tr>
-        <w:tc>
-          <w:tcPr>
-            <w:tcW w:type="dxa" w:w="454"/>
-          </w:tcPr>
-          <w:p>
-            <w:pPr>
-              <w:spacing w:after="0"/>
-            </w:pPr>
-            <w:r>
-              <w:rPr>
-                <w:sz w:val="17"/>
-              </w:rPr>
-              <w:t>6</w:t>
             </w:r>
           </w:p>
         </w:tc>

</xml_diff>